<commit_message>
Expand cloud image categories
</commit_message>
<xml_diff>
--- a/docs/LightBreaker用户手册.docx
+++ b/docs/LightBreaker用户手册.docx
@@ -1711,7 +1711,7 @@
           <w:color w:val="1F2937"/>
           <w:sz w:val="21"/>
         </w:rPr>
-        <w:t>2. 选择图片类型：自然风光、名画再现、城市建筑或抽象艺术。</w:t>
+        <w:t>2. 选择图片类型：自然风光、名画再现、城市建筑、抽象艺术、萌宠或科幻。</w:t>
       </w:r>
     </w:p>
     <w:p>
@@ -4545,7 +4545,7 @@
                 <w:color w:val="1F2937"/>
                 <w:sz w:val="18"/>
               </w:rPr>
-              <w:t>自然风光、名画再现、城市建筑、抽象艺术</w:t>
+              <w:t>自然风光、名画再现、城市建筑、抽象艺术、萌宠、科幻</w:t>
             </w:r>
           </w:p>
         </w:tc>

</xml_diff>

<commit_message>
Update LightBreaker UI and BLE settings
</commit_message>
<xml_diff>
--- a/docs/LightBreaker用户手册.docx
+++ b/docs/LightBreaker用户手册.docx
@@ -275,7 +275,7 @@
                 <w:color w:val="1F2937"/>
                 <w:sz w:val="18"/>
               </w:rPr>
-              <w:t>2026-05-17</w:t>
+              <w:t>2026-05-18</w:t>
             </w:r>
           </w:p>
         </w:tc>
@@ -389,7 +389,7 @@
                 <w:color w:val="1F2937"/>
                 <w:sz w:val="18"/>
               </w:rPr>
-              <w:t>Android 手机、BOXING#PL 左手手套、BOXING#PR 右手手套</w:t>
+              <w:t>Android 手机、BOXING#Lxxxxxx 左手手套、BOXING#Rxxxxxx 右手手套</w:t>
             </w:r>
           </w:p>
         </w:tc>
@@ -923,7 +923,7 @@
           <w:color w:val="1F2937"/>
           <w:sz w:val="21"/>
         </w:rPr>
-        <w:t>• 打开拳击手套电源，确认设备名称以 BOXING#PL 开头的是左手，以 BOXING#PR 开头的是右手。</w:t>
+        <w:t>• 打开拳击手套电源，确认设备名称为 BOXING#L 加 6 位数字或字母的是左手，BOXING#R 加 6 位数字或字母的是右手。</w:t>
       </w:r>
     </w:p>
     <w:p>
@@ -1119,7 +1119,7 @@
           <w:color w:val="1F2937"/>
           <w:sz w:val="21"/>
         </w:rPr>
-        <w:t>2. 在设备列表中选择 BOXING#PL... 或 BOXING#PR... 设备。</w:t>
+        <w:t>2. 在设备列表中选择 BOXING#Lxxxxxx 或 BOXING#Rxxxxxx 设备。</w:t>
       </w:r>
     </w:p>
     <w:p>
@@ -1386,7 +1386,7 @@
                 <w:color w:val="1F2937"/>
                 <w:sz w:val="18"/>
               </w:rPr>
-              <w:t>正在查找 BOXING#PL/PR 设备。</w:t>
+              <w:t>正在查找 BOXING#Lxxxxxx / BOXING#Rxxxxxx 设备。</w:t>
             </w:r>
           </w:p>
         </w:tc>
@@ -3685,7 +3685,7 @@
                 <w:color w:val="1F2937"/>
                 <w:sz w:val="18"/>
               </w:rPr>
-              <w:t>检查设备名称是否为 BOXING#PL 或 BOXING#PR；重启未出现的手套。</w:t>
+              <w:t>检查设备名称是否符合 BOXING#L/R 加 6 位数字或字母；重启未出现的手套。</w:t>
             </w:r>
           </w:p>
         </w:tc>
@@ -4602,7 +4602,7 @@
                 <w:color w:val="1F2937"/>
                 <w:sz w:val="18"/>
               </w:rPr>
-              <w:t>左手 BOXING#PL...；右手 BOXING#PR...</w:t>
+              <w:t>左手 BOXING#L + 6 位数字或字母；右手 BOXING#R + 6 位数字或字母</w:t>
             </w:r>
           </w:p>
         </w:tc>

</xml_diff>